<commit_message>
Compare incomplete external offers with the authenticated profile
</commit_message>
<xml_diff>
--- a/docs/RECTIFICATIF_CATALOGUE_V1.docx
+++ b/docs/RECTIFICATIF_CATALOGUE_V1.docx
@@ -579,6 +579,19 @@
         <w:t>Ce rectificatif ne transforme pas les annonces externes en contrats, missions internes ou candidatures suivies par InfiMatch.</w:t>
       </w:r>
     </w:p>
+    <w:p>
+      <w:pPr>
+        <w:pStyle w:val="Heading1"/>
+      </w:pPr>
+      <w:r>
+        <w:t>Complement : comparaison partielle des annonces externes</w:t>
+      </w:r>
+    </w:p>
+    <w:p>
+      <w:r>
+        <w:t>La comparaison au profil connecte est desormais disponible pour les annonces externes. La recherche reste stricte par defaut ; une option explicite permet de voir des pistes incompletes, avec les filtres non verifies signales. Les champs absents du profil et ceux absents de l annonce sont distingues. Aucun score complet ni disponibilite supposee. Voir EXPLICATION_MATCHING_DONNEES_MANQUANTES.docx pour les details et limites.</w:t>
+      </w:r>
+    </w:p>
     <w:sectPr>
       <w:pgSz w:w="12240" w:h="15840"/>
       <w:pgMar w:top="1440" w:right="1800" w:bottom="1440" w:left="1800" w:header="720" w:footer="720" w:gutter="0"/>

</xml_diff>